<commit_message>
update: Gemini fact-check 반영 — 6개 치명적 오류 수정
</commit_message>
<xml_diff>
--- a/files/Resonate_Club_Master_KO.docx
+++ b/files/Resonate_Club_Master_KO.docx
@@ -1241,7 +1241,7 @@
           <w:color w:val="1A3450"/>
           <w:sz w:val="36"/>
         </w:rPr>
-        <w:t>3.3 Step 2: 사업계획서 작성 및 공증 (8월 4~6일, 2~3일)</w:t>
+        <w:t>3.3 Step 2: 사업계획서 작성 (8월 4~6일, 2~3일)</w:t>
       </w:r>
     </w:p>
     <w:p>
@@ -1253,7 +1253,7 @@
         <w:rPr>
           <w:sz w:val="20"/>
         </w:rPr>
-        <w:t>• 행정사 선임 — 비용: 50~80만원</w:t>
+        <w:t>• 행정사 선임 (선택사항) — 비용: 50~80만원. 개인사업자는 공증 불필요, 일반 출력본으로 충분</w:t>
       </w:r>
     </w:p>
     <w:p>
@@ -1325,7 +1325,7 @@
         <w:rPr>
           <w:sz w:val="20"/>
         </w:rPr>
-        <w:t>• 공증사무소에서 사업계획서 공증</w:t>
+        <w:t>• 사업계획서 출력본 준비 (개인사업자는 공증 불필요)</w:t>
       </w:r>
     </w:p>
     <w:p>
@@ -1370,7 +1370,7 @@
         <w:rPr>
           <w:sz w:val="20"/>
         </w:rPr>
-        <w:t>• 은행에서 자본금 입금 확인증 발급</w:t>
+        <w:t>• 은행에서 자본금 잔액증명서 발급 + 세무사/회계사 확인 날인 영업용 자산명세서 작성 (여행업 등록 필수 서류)</w:t>
       </w:r>
     </w:p>
     <w:p>
@@ -1426,7 +1426,7 @@
         <w:rPr>
           <w:sz w:val="20"/>
         </w:rPr>
-        <w:t>• 구비 서류: 공증된 사업계획서, 자본금 입금 확인증, 임대차계약서, 대표 신분증, 신청서</w:t>
+        <w:t>• 구비 서류: 사업계획서, 영업용 자산명세서(세무사 확인 날인), 임대차계약서, 대표 신분증, 신청서</w:t>
       </w:r>
     </w:p>
     <w:p>
@@ -1463,7 +1463,7 @@
           <w:color w:val="1A3450"/>
           <w:sz w:val="36"/>
         </w:rPr>
-        <w:t>3.5 Step 4: 사업자등록 (8월 21~25일, 3~5일)</w:t>
+        <w:t>3.5 Step 4: 국내외여행업 등록 신청 — 구청 (8월 21~25일, 접수 및 서류 제출)</w:t>
       </w:r>
     </w:p>
     <w:p>
@@ -1475,7 +1475,7 @@
         <w:rPr>
           <w:sz w:val="20"/>
         </w:rPr>
-        <w:t>• 해운대세무서 방문</w:t>
+        <w:t>• 해운대구청 관광과 방문</w:t>
       </w:r>
     </w:p>
     <w:p>
@@ -1487,7 +1487,7 @@
         <w:rPr>
           <w:sz w:val="20"/>
         </w:rPr>
-        <w:t>• 사업자등록증 신청 — 업종: 국내외여행업</w:t>
+        <w:t>• 여행업 등록 신청서(별지 제9호 서식) 제출 — 업종: 국내외여행업</w:t>
       </w:r>
     </w:p>
     <w:p>
@@ -1499,7 +1499,7 @@
         <w:rPr>
           <w:sz w:val="20"/>
         </w:rPr>
-        <w:t>• 사업용 통장은 기존 개인통장 활용 (개인사업자, 별도 사업자계좌 불필요)</w:t>
+        <w:t>• 제출 서류: 사업계획서, 영업용 자산명세서(세무사 확인 날인), 보증보험증권, 임대차계약서, 대표 신분증</w:t>
       </w:r>
     </w:p>
     <w:p>
@@ -1511,7 +1511,7 @@
         <w:rPr>
           <w:sz w:val="20"/>
         </w:rPr>
-        <w:t>• 전자세금계산서 시스템 등록</w:t>
+        <w:t>• 구청 실사 (1~2주) → 관광사업등록증 발급</w:t>
       </w:r>
     </w:p>
     <w:p>
@@ -1524,7 +1524,7 @@
           <w:color w:val="1A3450"/>
           <w:sz w:val="36"/>
         </w:rPr>
-        <w:t>3.6 Step 5: 국내외여행업 등록 (8월 26일 – 9월 24일, 2~4주)</w:t>
+        <w:t>3.6 Step 5: 보증보험 가입 및 사업자등록 (8월 26일 – 9월 24일, 2~4주)</w:t>
       </w:r>
     </w:p>
     <w:p>
@@ -1532,7 +1532,7 @@
         <w:rPr>
           <w:sz w:val="21"/>
         </w:rPr>
-        <w:t>해운대구청 관광과 제출 서류:</w:t>
+        <w:t>보증보험 가입:</w:t>
       </w:r>
     </w:p>
     <w:p>
@@ -1544,7 +1544,7 @@
         <w:rPr>
           <w:sz w:val="20"/>
         </w:rPr>
-        <w:t>• 여행업 등록 신청서 (별지 제9호 서식)</w:t>
+        <w:t>• SGI 서울보증보험 방문 — 영업보증보험(₩3,000만원 보장한도, 연 보험료 ~₩30만원) + 배상책임보험(연 ~₩42만원)</w:t>
       </w:r>
     </w:p>
     <w:p>
@@ -1556,7 +1556,7 @@
         <w:rPr>
           <w:sz w:val="20"/>
         </w:rPr>
-        <w:t>• 사업계획서</w:t>
+        <w:t>• 보증보험증권 수령 후 관광사업등록증과 함께 세무서 제출 → 사업자등록증 발급</w:t>
       </w:r>
     </w:p>
     <w:p>
@@ -1970,7 +1970,7 @@
               <w:rPr>
                 <w:sz w:val="18"/>
               </w:rPr>
-              <w:t>사업계획서 작성 및 공증</w:t>
+              <w:t>사업계획서 작성</w:t>
             </w:r>
           </w:p>
         </w:tc>
@@ -3259,7 +3259,7 @@
         <w:rPr>
           <w:sz w:val="21"/>
         </w:rPr>
-        <w:t>기존 국내외여행업 라이선스로 처리 가능합니다. 수익 모델은 동일한 직영 마진입니다.</w:t>
+        <w:t>미국인 대상 인바운드는 종합여행업 등록이 필요하므로, Phase 2 종합여행업 전환 시점에 맞춰 런칭합니다 (국내외여행업은 내국인 대상만 가능). 수익 모델은 동일한 직영 마진입니다.</w:t>
       </w:r>
     </w:p>
     <w:p>
@@ -6327,7 +6327,7 @@
               <w:rPr>
                 <w:sz w:val="18"/>
               </w:rPr>
-              <w:t>대표 입국(F-4), 사무실 계약, 사업계획서 공증, 자본금 입금</w:t>
+              <w:t>대표 입국(F-4), 사무실 계약, 사업계획서 작성, 자본금 입금</w:t>
             </w:r>
           </w:p>
         </w:tc>
@@ -7982,7 +7982,7 @@
         <w:rPr>
           <w:sz w:val="20"/>
         </w:rPr>
-        <w:t>• 저출산·고령사회기본법 — 사업자 등록 요건</w:t>
+        <w:t>• 소득세법 — 개인사업자 과세</w:t>
       </w:r>
     </w:p>
     <w:p>
@@ -8274,7 +8274,7 @@
           <w:sz w:val="10"/>
           <w:szCs w:val="10"/>
         </w:rPr>
-        <w:t xml:space="preserve">▶ 1인 개인사업자도 중소기업 기준이 적용되어, 기본한도 연 3,600만원까지 인정됩니다 (일반적인 1,200만원이 아님).</w:t>
+        <w:t>▶ 1인 개인사업자도 중소기업 기준이 적용되어, 기본한도 연 3,600만원까지 인정됩니다 (일반적인 1,200만원이 아님). ⚠️ 단, 2026년 중 개업 시 월할 계산 적용: 9월 개업 기준 4개월분(9~12월)인 1,200만원만 인정. 첫해 3,600만원 전액 사용 시 세금 불이익 발생.</w:t>
       </w:r>
     </w:p>
     <w:p>
@@ -8532,7 +8532,7 @@
           <w:sz w:val="10"/>
           <w:szCs w:val="10"/>
         </w:rPr>
-        <w:t xml:space="preserve">[ ] 세무사 미팅 시 '중소기업 업무추진비 한도(3,600만원) 적용' 명시 요청</w:t>
+        <w:t>[ ] 세무사 미팅 시 '중소기업 업무추진비 한도(연 3,600만원, 2026년은 4개월분 1,200만원 월할계산)' 명시 요청</w:t>
       </w:r>
     </w:p>
     <w:p>

</xml_diff>

<commit_message>
update: 자본금 table math fix + 30% margin + 종합여행업 전환계획
</commit_message>
<xml_diff>
--- a/files/Resonate_Club_Master_KO.docx
+++ b/files/Resonate_Club_Master_KO.docx
@@ -2356,7 +2356,7 @@
         <w:rPr>
           <w:sz w:val="21"/>
         </w:rPr>
-        <w:t>리조네이트 클럽은 한국 고소득 골퍼를 대상으로 미국 프리미엄 골프 여행을 개별 맞춤 설계합니다. 운영 방식은 직영 마진으로, 고객을 미국 현지 골프 코스·호텔·서비스 업체와 연결하고 예약 건당 5~15%의 수수료를 수취합니다.</w:t>
+        <w:t>리조네이트 클럽은 한국 고소득 골퍼를 대상으로 미국 프리미엄 골프 여행을 개별 맞춤 설계합니다. 운영 방식은 직영 마진으로, 고객을 미국 현지 골프 코스·호텔·서비스 업체와 연결하고 럭셔리 투어 시장 내부 마진 기준 30%의 직영 마진을 적용합니다.</w:t>
       </w:r>
     </w:p>
     <w:p>
@@ -3258,7 +3258,7 @@
         <w:rPr>
           <w:sz w:val="21"/>
         </w:rPr>
-        <w:t>미국인 대상 인바운드는 종합여행업 등록이 필요하므로, Phase 2 종합여행업 전환 시점에 맞춰 런칭합니다 (국내외여행업은 내국인 대상만 가능). 수익 모델은 동일한 직영 마진입니다.</w:t>
+        <w:t>미국인 대상 인바운드는 종합여행업 등록이 필요하므로, Phase 2 종합여행업 전환(6개월~1년 후, 자본금 5,000만원·보증보험 5,000만원) 시점에 맞춰 런칭합니다 (국내외여행업은 내국인 대상만 가능). 종합여행업 전환 계획은 7장 성장 로드맵에 상세히 기술되어 있습니다. 수익 모델은 동일한 30% 직영 마진입니다.</w:t>
       </w:r>
     </w:p>
     <w:p>
@@ -4237,7 +4237,7 @@
               <w:rPr>
                 <w:sz w:val="18"/>
               </w:rPr>
-              <w:t>4,920~5,450만원</w:t>
+              <w:t>2,220~2,750만원</w:t>
             </w:r>
           </w:p>
         </w:tc>
@@ -4321,7 +4321,7 @@
               <w:rPr>
                 <w:sz w:val="18"/>
               </w:rPr>
-              <w:t>3,030~3,560만원</w:t>
+              <w:t>328~858만원</w:t>
             </w:r>
           </w:p>
         </w:tc>
@@ -4335,7 +4335,7 @@
               <w:rPr>
                 <w:sz w:val="18"/>
               </w:rPr>
-              <w:t>설립 시점부터 약 2.6년 커버</w:t>
+              <w:t>약 2~5개월 커버 (추가 수익 필요)</w:t>
             </w:r>
           </w:p>
         </w:tc>
@@ -4874,7 +4874,7 @@
         <w:rPr>
           <w:sz w:val="20"/>
         </w:rPr>
-        <w:t>• 평균 커미션 10% 기준: 월 약 $15,770 예약 필요</w:t>
+        <w:t>• 30% 직영 마진 기준: 월 약 $3,500 예약 필요</w:t>
       </w:r>
     </w:p>
     <w:p>
@@ -4886,7 +4886,7 @@
         <w:rPr>
           <w:sz w:val="20"/>
         </w:rPr>
-        <w:t>• 그룹당 평균 $10,000 예약 가정: 월 약 1.6그룹 → 안전마진 포함 2그룹/월 목표</w:t>
+        <w:t>• 그룹당 평균 $10,000 예약 가정: 연 4~5그룹 → 월 0.4그룹으로 손익분기 도달, 안전마진 포함 연 6그룹 목표</w:t>
       </w:r>
     </w:p>
     <w:p>

</xml_diff>